<commit_message>
Add presensi, jumlah_jam and link_dokumentasi
Replace individual jam_mulai/jam_selesai fields with jumlah_jam and add link_dokumentasi support across backend and frontend. Models (Lembur, LemburPegawai) and migrations updated (add link_dokumentasi, jumlah_jam, jam_berangkat/jam_pulang; create spkl table moved/adjusted). SpklController: add patch endpoint to process uploaded presensi, enhance print routine to include presensi table and duration calculations. UI: update layouts and pages (Lembur, MyLembur, Verify, Spkl) to show jumlah_jam, link buttons, sidebar label, new Presensi.vue page and presensi upload dialog with XLSX parsing, template download, and client-side mapping to patch endpoint. Also add template files (template_presensi_lembur.xlsx) and update SPKL docx template.
</commit_message>
<xml_diff>
--- a/public/document/template_spkl.docx
+++ b/public/document/template_spkl.docx
@@ -641,10 +641,93 @@
           <w:rFonts w:ascii="Arial" w:hAnsi="Arial" w:cs="Arial"/>
           <w:lang w:val="sv-SE"/>
         </w:rPr>
-      </w:pPr>
+        <w:sectPr>
+          <w:headerReference w:type="default" r:id="rId8"/>
+          <w:pgSz w:w="11906" w:h="16838"/>
+          <w:pgMar w:top="851" w:right="1191" w:bottom="1440" w:left="1191" w:header="709" w:footer="709" w:gutter="0"/>
+          <w:cols w:space="708"/>
+          <w:titlePg/>
+          <w:docGrid w:linePitch="360"/>
+        </w:sectPr>
+      </w:pPr>
+    </w:p>
+    <w:p>
+      <w:pPr>
+        <w:spacing w:after="0"/>
+        <w:jc w:val="center"/>
+        <w:rPr>
+          <w:rFonts w:ascii="Arial" w:hAnsi="Arial" w:cs="Arial"/>
+          <w:b/>
+          <w:bCs/>
+          <w:u w:val="single"/>
+          <w:lang w:val="sv-SE"/>
+        </w:rPr>
+      </w:pPr>
+      <w:r>
+        <w:rPr>
+          <w:rFonts w:ascii="Arial" w:hAnsi="Arial" w:cs="Arial"/>
+          <w:b/>
+          <w:bCs/>
+          <w:u w:val="single"/>
+          <w:lang w:val="sv-SE"/>
+        </w:rPr>
+        <w:lastRenderedPageBreak/>
+        <w:t>REKAP PRESENSI LEMBUR PEGAWAI BPS PROVINSI SULAWESI UTARA</w:t>
+      </w:r>
+    </w:p>
+    <w:p>
+      <w:pPr>
+        <w:spacing w:after="0"/>
+        <w:jc w:val="center"/>
+        <w:rPr>
+          <w:rFonts w:ascii="Arial" w:hAnsi="Arial" w:cs="Arial"/>
+          <w:b/>
+          <w:bCs/>
+          <w:lang w:val="sv-SE"/>
+        </w:rPr>
+      </w:pPr>
+      <w:r>
+        <w:rPr>
+          <w:rFonts w:ascii="Arial" w:hAnsi="Arial" w:cs="Arial"/>
+          <w:b/>
+          <w:bCs/>
+          <w:lang w:val="sv-SE"/>
+        </w:rPr>
+        <w:t>Periode Bulan ${presensiMonth} ${presensiYear}</w:t>
+      </w:r>
+    </w:p>
+    <w:p>
+      <w:pPr>
+        <w:spacing w:after="0"/>
+        <w:rPr>
+          <w:rFonts w:ascii="Arial" w:hAnsi="Arial" w:cs="Arial"/>
+          <w:b/>
+          <w:bCs/>
+          <w:lang w:val="sv-SE"/>
+        </w:rPr>
+      </w:pPr>
+    </w:p>
+    <w:p>
+      <w:pPr>
+        <w:spacing w:after="0"/>
+        <w:rPr>
+          <w:rFonts w:ascii="Arial" w:hAnsi="Arial" w:cs="Arial"/>
+          <w:b/>
+          <w:bCs/>
+          <w:lang w:val="sv-SE"/>
+        </w:rPr>
+      </w:pPr>
+      <w:r>
+        <w:rPr>
+          <w:rFonts w:ascii="Arial" w:hAnsi="Arial" w:cs="Arial"/>
+          <w:b/>
+          <w:bCs/>
+          <w:lang w:val="sv-SE"/>
+        </w:rPr>
+        <w:t>${presensiData}</w:t>
+      </w:r>
     </w:p>
     <w:sectPr>
-      <w:headerReference w:type="default" r:id="rId8"/>
       <w:pgSz w:w="11906" w:h="16838"/>
       <w:pgMar w:top="851" w:right="1191" w:bottom="1440" w:left="1191" w:header="709" w:footer="709" w:gutter="0"/>
       <w:cols w:space="708"/>
@@ -1593,7 +1676,7 @@
   <w:style w:type="paragraph" w:default="1" w:styleId="Normal">
     <w:name w:val="Normal"/>
     <w:qFormat/>
-    <w:rsid w:val="00A10FC7"/>
+    <w:rsid w:val="00E8577C"/>
     <w:rPr>
       <w:kern w:val="0"/>
       <w:lang w:val="en-US"/>

</xml_diff>

<commit_message>
Add ttd_rekap and refine SPKL export
Support selecting a signature for the attendance recap (ttd_rekap) and improve SPKL generation. Controller: import TimKerja, provide tim_kerja options to the page, require and validate ttd_rekap, handle missing KPA safely, set ttd_rekap and its ketua into the Word template, and fix duration calculation by using a durasi_final variable so calculated hours respect actual in/out times and configured duration. Views: Spkl.vue adds the ttd_rekap select, displays validation errors for fields (tahun_dipa, tanggal_pengajuan, nomor_spkl, ttd_rekap), wires tim_kerja prop and form.ttd_rekap; Laporan.vue removes a stray console.log. The Word template (template_spkl.docx) was updated accordingly.
</commit_message>
<xml_diff>
--- a/public/document/template_spkl.docx
+++ b/public/document/template_spkl.docx
@@ -726,6 +726,309 @@
         </w:rPr>
         <w:t>${presensiData}</w:t>
       </w:r>
+    </w:p>
+    <w:p>
+      <w:pPr>
+        <w:spacing w:after="0"/>
+        <w:rPr>
+          <w:rFonts w:ascii="Arial" w:hAnsi="Arial" w:cs="Arial"/>
+          <w:b/>
+          <w:bCs/>
+          <w:lang w:val="sv-SE"/>
+        </w:rPr>
+      </w:pPr>
+    </w:p>
+    <w:tbl>
+      <w:tblPr>
+        <w:tblStyle w:val="TableGrid"/>
+        <w:tblW w:w="0" w:type="auto"/>
+        <w:tblBorders>
+          <w:top w:val="none" w:sz="0" w:space="0" w:color="auto"/>
+          <w:left w:val="none" w:sz="0" w:space="0" w:color="auto"/>
+          <w:bottom w:val="none" w:sz="0" w:space="0" w:color="auto"/>
+          <w:right w:val="none" w:sz="0" w:space="0" w:color="auto"/>
+          <w:insideH w:val="none" w:sz="0" w:space="0" w:color="auto"/>
+          <w:insideV w:val="none" w:sz="0" w:space="0" w:color="auto"/>
+        </w:tblBorders>
+        <w:tblLook w:val="04A0" w:firstRow="1" w:lastRow="0" w:firstColumn="1" w:lastColumn="0" w:noHBand="0" w:noVBand="1"/>
+      </w:tblPr>
+      <w:tblGrid>
+        <w:gridCol w:w="3171"/>
+        <w:gridCol w:w="3171"/>
+        <w:gridCol w:w="3172"/>
+      </w:tblGrid>
+      <w:tr>
+        <w:tc>
+          <w:tcPr>
+            <w:tcW w:w="3171" w:type="dxa"/>
+          </w:tcPr>
+          <w:p>
+            <w:pPr>
+              <w:jc w:val="both"/>
+              <w:rPr>
+                <w:rFonts w:ascii="Arial" w:hAnsi="Arial" w:cs="Arial"/>
+                <w:lang w:val="sv-SE"/>
+              </w:rPr>
+            </w:pPr>
+          </w:p>
+        </w:tc>
+        <w:tc>
+          <w:tcPr>
+            <w:tcW w:w="3171" w:type="dxa"/>
+          </w:tcPr>
+          <w:p>
+            <w:pPr>
+              <w:jc w:val="both"/>
+              <w:rPr>
+                <w:rFonts w:ascii="Arial" w:hAnsi="Arial" w:cs="Arial"/>
+                <w:lang w:val="sv-SE"/>
+              </w:rPr>
+            </w:pPr>
+          </w:p>
+        </w:tc>
+        <w:tc>
+          <w:tcPr>
+            <w:tcW w:w="3172" w:type="dxa"/>
+          </w:tcPr>
+          <w:p>
+            <w:pPr>
+              <w:jc w:val="both"/>
+              <w:rPr>
+                <w:rFonts w:ascii="Arial" w:hAnsi="Arial" w:cs="Arial"/>
+                <w:lang w:val="sv-SE"/>
+              </w:rPr>
+            </w:pPr>
+            <w:r>
+              <w:rPr>
+                <w:rFonts w:ascii="Arial" w:hAnsi="Arial" w:cs="Arial"/>
+                <w:lang w:val="sv-SE"/>
+              </w:rPr>
+              <w:t>Manado, ${tanggal}</w:t>
+            </w:r>
+          </w:p>
+        </w:tc>
+      </w:tr>
+      <w:tr>
+        <w:tc>
+          <w:tcPr>
+            <w:tcW w:w="3171" w:type="dxa"/>
+          </w:tcPr>
+          <w:p>
+            <w:pPr>
+              <w:jc w:val="both"/>
+              <w:rPr>
+                <w:rFonts w:ascii="Arial" w:hAnsi="Arial" w:cs="Arial"/>
+                <w:lang w:val="sv-SE"/>
+              </w:rPr>
+            </w:pPr>
+          </w:p>
+        </w:tc>
+        <w:tc>
+          <w:tcPr>
+            <w:tcW w:w="3171" w:type="dxa"/>
+          </w:tcPr>
+          <w:p>
+            <w:pPr>
+              <w:jc w:val="both"/>
+              <w:rPr>
+                <w:rFonts w:ascii="Arial" w:hAnsi="Arial" w:cs="Arial"/>
+                <w:lang w:val="sv-SE"/>
+              </w:rPr>
+            </w:pPr>
+          </w:p>
+        </w:tc>
+        <w:tc>
+          <w:tcPr>
+            <w:tcW w:w="3172" w:type="dxa"/>
+          </w:tcPr>
+          <w:p>
+            <w:pPr>
+              <w:jc w:val="both"/>
+              <w:rPr>
+                <w:rFonts w:ascii="Arial" w:hAnsi="Arial" w:cs="Arial"/>
+                <w:lang w:val="sv-SE"/>
+              </w:rPr>
+            </w:pPr>
+            <w:r>
+              <w:rPr>
+                <w:rFonts w:ascii="Arial" w:hAnsi="Arial" w:cs="Arial"/>
+                <w:lang w:val="sv-SE"/>
+              </w:rPr>
+              <w:t>Ketua ${</w:t>
+            </w:r>
+            <w:r>
+              <w:rPr>
+                <w:rFonts w:ascii="Arial" w:hAnsi="Arial" w:cs="Arial"/>
+                <w:lang w:val="sv-SE"/>
+              </w:rPr>
+              <w:t>ttd_rekap</w:t>
+            </w:r>
+            <w:r>
+              <w:rPr>
+                <w:rFonts w:ascii="Arial" w:hAnsi="Arial" w:cs="Arial"/>
+                <w:lang w:val="sv-SE"/>
+              </w:rPr>
+              <w:t>}</w:t>
+            </w:r>
+          </w:p>
+        </w:tc>
+      </w:tr>
+      <w:tr>
+        <w:tc>
+          <w:tcPr>
+            <w:tcW w:w="3171" w:type="dxa"/>
+          </w:tcPr>
+          <w:p>
+            <w:pPr>
+              <w:jc w:val="both"/>
+              <w:rPr>
+                <w:rFonts w:ascii="Arial" w:hAnsi="Arial" w:cs="Arial"/>
+                <w:lang w:val="sv-SE"/>
+              </w:rPr>
+            </w:pPr>
+          </w:p>
+        </w:tc>
+        <w:tc>
+          <w:tcPr>
+            <w:tcW w:w="3171" w:type="dxa"/>
+          </w:tcPr>
+          <w:p>
+            <w:pPr>
+              <w:jc w:val="both"/>
+              <w:rPr>
+                <w:rFonts w:ascii="Arial" w:hAnsi="Arial" w:cs="Arial"/>
+                <w:lang w:val="sv-SE"/>
+              </w:rPr>
+            </w:pPr>
+          </w:p>
+        </w:tc>
+        <w:tc>
+          <w:tcPr>
+            <w:tcW w:w="3172" w:type="dxa"/>
+          </w:tcPr>
+          <w:p>
+            <w:pPr>
+              <w:jc w:val="both"/>
+              <w:rPr>
+                <w:rFonts w:ascii="Arial" w:hAnsi="Arial" w:cs="Arial"/>
+                <w:lang w:val="sv-SE"/>
+              </w:rPr>
+            </w:pPr>
+          </w:p>
+          <w:p>
+            <w:pPr>
+              <w:jc w:val="both"/>
+              <w:rPr>
+                <w:rFonts w:ascii="Arial" w:hAnsi="Arial" w:cs="Arial"/>
+                <w:lang w:val="sv-SE"/>
+              </w:rPr>
+            </w:pPr>
+          </w:p>
+          <w:p>
+            <w:pPr>
+              <w:jc w:val="both"/>
+              <w:rPr>
+                <w:rFonts w:ascii="Arial" w:hAnsi="Arial" w:cs="Arial"/>
+                <w:lang w:val="sv-SE"/>
+              </w:rPr>
+            </w:pPr>
+          </w:p>
+          <w:p>
+            <w:pPr>
+              <w:jc w:val="both"/>
+              <w:rPr>
+                <w:rFonts w:ascii="Arial" w:hAnsi="Arial" w:cs="Arial"/>
+                <w:lang w:val="sv-SE"/>
+              </w:rPr>
+            </w:pPr>
+          </w:p>
+          <w:p>
+            <w:pPr>
+              <w:jc w:val="both"/>
+              <w:rPr>
+                <w:rFonts w:ascii="Arial" w:hAnsi="Arial" w:cs="Arial"/>
+                <w:lang w:val="sv-SE"/>
+              </w:rPr>
+            </w:pPr>
+          </w:p>
+        </w:tc>
+      </w:tr>
+      <w:tr>
+        <w:tc>
+          <w:tcPr>
+            <w:tcW w:w="3171" w:type="dxa"/>
+          </w:tcPr>
+          <w:p>
+            <w:pPr>
+              <w:jc w:val="both"/>
+              <w:rPr>
+                <w:rFonts w:ascii="Arial" w:hAnsi="Arial" w:cs="Arial"/>
+                <w:lang w:val="sv-SE"/>
+              </w:rPr>
+            </w:pPr>
+          </w:p>
+        </w:tc>
+        <w:tc>
+          <w:tcPr>
+            <w:tcW w:w="3171" w:type="dxa"/>
+          </w:tcPr>
+          <w:p>
+            <w:pPr>
+              <w:jc w:val="both"/>
+              <w:rPr>
+                <w:rFonts w:ascii="Arial" w:hAnsi="Arial" w:cs="Arial"/>
+                <w:lang w:val="sv-SE"/>
+              </w:rPr>
+            </w:pPr>
+          </w:p>
+        </w:tc>
+        <w:tc>
+          <w:tcPr>
+            <w:tcW w:w="3172" w:type="dxa"/>
+          </w:tcPr>
+          <w:p>
+            <w:pPr>
+              <w:jc w:val="both"/>
+              <w:rPr>
+                <w:rFonts w:ascii="Arial" w:hAnsi="Arial" w:cs="Arial"/>
+                <w:lang w:val="sv-SE"/>
+              </w:rPr>
+            </w:pPr>
+            <w:r>
+              <w:rPr>
+                <w:rFonts w:ascii="Arial" w:hAnsi="Arial" w:cs="Arial"/>
+                <w:lang w:val="sv-SE"/>
+              </w:rPr>
+              <w:t>${ketua_</w:t>
+            </w:r>
+            <w:r>
+              <w:rPr>
+                <w:rFonts w:ascii="Arial" w:hAnsi="Arial" w:cs="Arial"/>
+                <w:lang w:val="sv-SE"/>
+              </w:rPr>
+              <w:t>ttd_rekap</w:t>
+            </w:r>
+            <w:r>
+              <w:rPr>
+                <w:rFonts w:ascii="Arial" w:hAnsi="Arial" w:cs="Arial"/>
+                <w:lang w:val="sv-SE"/>
+              </w:rPr>
+              <w:t>}</w:t>
+            </w:r>
+          </w:p>
+        </w:tc>
+      </w:tr>
+    </w:tbl>
+    <w:p>
+      <w:pPr>
+        <w:spacing w:after="0"/>
+        <w:rPr>
+          <w:rFonts w:ascii="Arial" w:hAnsi="Arial" w:cs="Arial"/>
+          <w:b/>
+          <w:bCs/>
+          <w:lang w:val="sv-SE"/>
+        </w:rPr>
+      </w:pPr>
     </w:p>
     <w:sectPr>
       <w:pgSz w:w="11906" w:h="16838"/>
@@ -1676,7 +1979,7 @@
   <w:style w:type="paragraph" w:default="1" w:styleId="Normal">
     <w:name w:val="Normal"/>
     <w:qFormat/>
-    <w:rsid w:val="00E8577C"/>
+    <w:rsid w:val="00736071"/>
     <w:rPr>
       <w:kern w:val="0"/>
       <w:lang w:val="en-US"/>

</xml_diff>